<commit_message>
Replace monthly CRM report with corrected version
</commit_message>
<xml_diff>
--- a/monthly-crm-report.docx
+++ b/monthly-crm-report.docx
@@ -268,7 +268,7 @@
         <w:pBdr>
           <w:bottom w:val="single" w:color="D5DAD6" w:sz="6"/>
         </w:pBdr>
-        <w:spacing w:after="110" w:before="240"/>
+        <w:spacing w:after="110" w:before="220"/>
       </w:pPr>
       <w:r>
         <w:rPr>
@@ -327,18 +327,32 @@
                 <w:sz w:val="52"/>
                 <w:szCs w:val="52"/>
               </w:rPr>
-              <w:t xml:space="preserve">18</w:t>
-            </w:r>
-          </w:p>
-          <w:p>
-            <w:r>
-              <w:rPr>
-                <w:rFonts w:ascii="Calibri" w:cs="Calibri" w:eastAsia="Calibri" w:hAnsi="Calibri"/>
-                <w:color w:val="6B7570"/>
+              <w:t xml:space="preserve">32</w:t>
+            </w:r>
+          </w:p>
+          <w:p>
+            <w:pPr>
+              <w:spacing w:after="10"/>
+            </w:pPr>
+            <w:r>
+              <w:rPr>
+                <w:rFonts w:ascii="Calibri" w:cs="Calibri" w:eastAsia="Calibri" w:hAnsi="Calibri"/>
+                <w:color w:val="1F2A26"/>
                 <w:sz w:val="19"/>
                 <w:szCs w:val="19"/>
               </w:rPr>
               <w:t xml:space="preserve">Active projects</w:t>
+            </w:r>
+          </w:p>
+          <w:p>
+            <w:r>
+              <w:rPr>
+                <w:rFonts w:ascii="Calibri" w:cs="Calibri" w:eastAsia="Calibri" w:hAnsi="Calibri"/>
+                <w:color w:val="2F5D4C"/>
+                <w:sz w:val="17"/>
+                <w:szCs w:val="17"/>
+              </w:rPr>
+              <w:t xml:space="preserve">Up from 29 in August</w:t>
             </w:r>
           </w:p>
         </w:tc>
@@ -373,14 +387,28 @@
             </w:r>
           </w:p>
           <w:p>
-            <w:r>
-              <w:rPr>
-                <w:rFonts w:ascii="Calibri" w:cs="Calibri" w:eastAsia="Calibri" w:hAnsi="Calibri"/>
-                <w:color w:val="6B7570"/>
+            <w:pPr>
+              <w:spacing w:after="10"/>
+            </w:pPr>
+            <w:r>
+              <w:rPr>
+                <w:rFonts w:ascii="Calibri" w:cs="Calibri" w:eastAsia="Calibri" w:hAnsi="Calibri"/>
+                <w:color w:val="1F2A26"/>
                 <w:sz w:val="19"/>
                 <w:szCs w:val="19"/>
               </w:rPr>
               <w:t xml:space="preserve">New opportunities</w:t>
+            </w:r>
+          </w:p>
+          <w:p>
+            <w:r>
+              <w:rPr>
+                <w:rFonts w:ascii="Calibri" w:cs="Calibri" w:eastAsia="Calibri" w:hAnsi="Calibri"/>
+                <w:color w:val="2F5D4C"/>
+                <w:sz w:val="17"/>
+                <w:szCs w:val="17"/>
+              </w:rPr>
+              <w:t xml:space="preserve">Up from 9 in August</w:t>
             </w:r>
           </w:p>
         </w:tc>
@@ -415,14 +443,28 @@
             </w:r>
           </w:p>
           <w:p>
-            <w:r>
-              <w:rPr>
-                <w:rFonts w:ascii="Calibri" w:cs="Calibri" w:eastAsia="Calibri" w:hAnsi="Calibri"/>
-                <w:color w:val="6B7570"/>
+            <w:pPr>
+              <w:spacing w:after="10"/>
+            </w:pPr>
+            <w:r>
+              <w:rPr>
+                <w:rFonts w:ascii="Calibri" w:cs="Calibri" w:eastAsia="Calibri" w:hAnsi="Calibri"/>
+                <w:color w:val="1F2A26"/>
                 <w:sz w:val="19"/>
                 <w:szCs w:val="19"/>
               </w:rPr>
               <w:t xml:space="preserve">Proposals sent</w:t>
+            </w:r>
+          </w:p>
+          <w:p>
+            <w:r>
+              <w:rPr>
+                <w:rFonts w:ascii="Calibri" w:cs="Calibri" w:eastAsia="Calibri" w:hAnsi="Calibri"/>
+                <w:color w:val="2F5D4C"/>
+                <w:sz w:val="17"/>
+                <w:szCs w:val="17"/>
+              </w:rPr>
+              <w:t xml:space="preserve">Up from 5 in August</w:t>
             </w:r>
           </w:p>
         </w:tc>
@@ -459,14 +501,28 @@
             </w:r>
           </w:p>
           <w:p>
-            <w:r>
-              <w:rPr>
-                <w:rFonts w:ascii="Calibri" w:cs="Calibri" w:eastAsia="Calibri" w:hAnsi="Calibri"/>
-                <w:color w:val="6B7570"/>
+            <w:pPr>
+              <w:spacing w:after="10"/>
+            </w:pPr>
+            <w:r>
+              <w:rPr>
+                <w:rFonts w:ascii="Calibri" w:cs="Calibri" w:eastAsia="Calibri" w:hAnsi="Calibri"/>
+                <w:color w:val="1F2A26"/>
                 <w:sz w:val="19"/>
                 <w:szCs w:val="19"/>
               </w:rPr>
               <w:t xml:space="preserve">Projects awarded</w:t>
+            </w:r>
+          </w:p>
+          <w:p>
+            <w:r>
+              <w:rPr>
+                <w:rFonts w:ascii="Calibri" w:cs="Calibri" w:eastAsia="Calibri" w:hAnsi="Calibri"/>
+                <w:color w:val="2F5D4C"/>
+                <w:sz w:val="17"/>
+                <w:szCs w:val="17"/>
+              </w:rPr>
+              <w:t xml:space="preserve">Same as August</w:t>
             </w:r>
           </w:p>
         </w:tc>
@@ -501,14 +557,28 @@
             </w:r>
           </w:p>
           <w:p>
-            <w:r>
-              <w:rPr>
-                <w:rFonts w:ascii="Calibri" w:cs="Calibri" w:eastAsia="Calibri" w:hAnsi="Calibri"/>
-                <w:color w:val="6B7570"/>
+            <w:pPr>
+              <w:spacing w:after="10"/>
+            </w:pPr>
+            <w:r>
+              <w:rPr>
+                <w:rFonts w:ascii="Calibri" w:cs="Calibri" w:eastAsia="Calibri" w:hAnsi="Calibri"/>
+                <w:color w:val="1F2A26"/>
                 <w:sz w:val="19"/>
                 <w:szCs w:val="19"/>
               </w:rPr>
               <w:t xml:space="preserve">Projects closed</w:t>
+            </w:r>
+          </w:p>
+          <w:p>
+            <w:r>
+              <w:rPr>
+                <w:rFonts w:ascii="Calibri" w:cs="Calibri" w:eastAsia="Calibri" w:hAnsi="Calibri"/>
+                <w:color w:val="2F5D4C"/>
+                <w:sz w:val="17"/>
+                <w:szCs w:val="17"/>
+              </w:rPr>
+              <w:t xml:space="preserve">Up from 3 in August</w:t>
             </w:r>
           </w:p>
         </w:tc>
@@ -543,14 +613,28 @@
             </w:r>
           </w:p>
           <w:p>
-            <w:r>
-              <w:rPr>
-                <w:rFonts w:ascii="Calibri" w:cs="Calibri" w:eastAsia="Calibri" w:hAnsi="Calibri"/>
-                <w:color w:val="6B7570"/>
+            <w:pPr>
+              <w:spacing w:after="10"/>
+            </w:pPr>
+            <w:r>
+              <w:rPr>
+                <w:rFonts w:ascii="Calibri" w:cs="Calibri" w:eastAsia="Calibri" w:hAnsi="Calibri"/>
+                <w:color w:val="1F2A26"/>
                 <w:sz w:val="19"/>
                 <w:szCs w:val="19"/>
               </w:rPr>
               <w:t xml:space="preserve">Closed project value</w:t>
+            </w:r>
+          </w:p>
+          <w:p>
+            <w:r>
+              <w:rPr>
+                <w:rFonts w:ascii="Calibri" w:cs="Calibri" w:eastAsia="Calibri" w:hAnsi="Calibri"/>
+                <w:color w:val="2F5D4C"/>
+                <w:sz w:val="17"/>
+                <w:szCs w:val="17"/>
+              </w:rPr>
+              <w:t xml:space="preserve">Up from $48K in August</w:t>
             </w:r>
           </w:p>
         </w:tc>
@@ -562,7 +646,7 @@
         <w:pBdr>
           <w:bottom w:val="single" w:color="D5DAD6" w:sz="6"/>
         </w:pBdr>
-        <w:spacing w:after="110" w:before="240"/>
+        <w:spacing w:after="110" w:before="220"/>
       </w:pPr>
       <w:r>
         <w:rPr>
@@ -638,7 +722,7 @@
     </w:p>
     <w:p>
       <w:pPr>
-        <w:spacing w:after="0"/>
+        <w:spacing w:after="140"/>
       </w:pPr>
       <w:r>
         <w:rPr>
@@ -649,7 +733,22 @@
           <w:sz w:val="18"/>
           <w:szCs w:val="18"/>
         </w:rPr>
-        <w:t xml:space="preserve">Projects by pipeline stage</w:t>
+        <w:t xml:space="preserve">Projects by pipeline stage. Active projects are those from Qualified through In Progress.</w:t>
+      </w:r>
+    </w:p>
+    <w:p>
+      <w:pPr>
+        <w:keepNext/>
+        <w:spacing w:after="120" w:line="276"/>
+      </w:pPr>
+      <w:r>
+        <w:rPr>
+          <w:rFonts w:ascii="Calibri" w:cs="Calibri" w:eastAsia="Calibri" w:hAnsi="Calibri"/>
+          <w:color w:val="1F2A26"/>
+          <w:sz w:val="21"/>
+          <w:szCs w:val="21"/>
+        </w:rPr>
+        <w:t xml:space="preserve">In Progress is the largest stage at nine projects, and eight newly logged items are still waiting for review.</w:t>
       </w:r>
     </w:p>
     <w:p>
@@ -659,7 +758,7 @@
         <w:pBdr>
           <w:bottom w:val="single" w:color="D5DAD6" w:sz="6"/>
         </w:pBdr>
-        <w:spacing w:after="110" w:before="240"/>
+        <w:spacing w:after="110" w:before="220"/>
       </w:pPr>
       <w:r>
         <w:rPr>
@@ -1529,7 +1628,7 @@
         <w:pBdr>
           <w:bottom w:val="single" w:color="D5DAD6" w:sz="6"/>
         </w:pBdr>
-        <w:spacing w:after="110" w:before="240"/>
+        <w:spacing w:after="110" w:before="220"/>
       </w:pPr>
       <w:r>
         <w:rPr>
@@ -1574,9 +1673,9 @@
               <w:right w:val="none" w:color="FFFFFF" w:sz="0"/>
             </w:tcBorders>
             <w:tcMar>
-              <w:top w:type="dxa" w:w="80"/>
-              <w:left w:type="dxa" w:w="0"/>
-              <w:bottom w:type="dxa" w:w="80"/>
+              <w:top w:type="dxa" w:w="60"/>
+              <w:left w:type="dxa" w:w="0"/>
+              <w:bottom w:type="dxa" w:w="60"/>
               <w:right w:type="dxa" w:w="140"/>
             </w:tcMar>
             <w:vAlign w:val="center"/>
@@ -1605,9 +1704,9 @@
               <w:right w:val="none" w:color="FFFFFF" w:sz="0"/>
             </w:tcBorders>
             <w:tcMar>
-              <w:top w:type="dxa" w:w="80"/>
-              <w:left w:type="dxa" w:w="0"/>
-              <w:bottom w:type="dxa" w:w="80"/>
+              <w:top w:type="dxa" w:w="60"/>
+              <w:left w:type="dxa" w:w="0"/>
+              <w:bottom w:type="dxa" w:w="60"/>
               <w:right w:type="dxa" w:w="140"/>
             </w:tcMar>
             <w:vAlign w:val="center"/>
@@ -1637,9 +1736,9 @@
               <w:right w:val="none" w:color="FFFFFF" w:sz="0"/>
             </w:tcBorders>
             <w:tcMar>
-              <w:top w:type="dxa" w:w="80"/>
+              <w:top w:type="dxa" w:w="60"/>
               <w:left w:type="dxa" w:w="280"/>
-              <w:bottom w:type="dxa" w:w="80"/>
+              <w:bottom w:type="dxa" w:w="60"/>
               <w:right w:type="dxa" w:w="0"/>
             </w:tcMar>
             <w:vAlign w:val="center"/>
@@ -1671,9 +1770,9 @@
               <w:right w:val="none" w:color="FFFFFF" w:sz="0"/>
             </w:tcBorders>
             <w:tcMar>
-              <w:top w:type="dxa" w:w="80"/>
-              <w:left w:type="dxa" w:w="0"/>
-              <w:bottom w:type="dxa" w:w="80"/>
+              <w:top w:type="dxa" w:w="60"/>
+              <w:left w:type="dxa" w:w="0"/>
+              <w:bottom w:type="dxa" w:w="60"/>
               <w:right w:type="dxa" w:w="140"/>
             </w:tcMar>
             <w:vAlign w:val="center"/>
@@ -1702,9 +1801,9 @@
               <w:right w:val="none" w:color="FFFFFF" w:sz="0"/>
             </w:tcBorders>
             <w:tcMar>
-              <w:top w:type="dxa" w:w="80"/>
-              <w:left w:type="dxa" w:w="0"/>
-              <w:bottom w:type="dxa" w:w="80"/>
+              <w:top w:type="dxa" w:w="60"/>
+              <w:left w:type="dxa" w:w="0"/>
+              <w:bottom w:type="dxa" w:w="60"/>
               <w:right w:type="dxa" w:w="140"/>
             </w:tcMar>
             <w:vAlign w:val="center"/>
@@ -1734,9 +1833,9 @@
               <w:right w:val="none" w:color="FFFFFF" w:sz="0"/>
             </w:tcBorders>
             <w:tcMar>
-              <w:top w:type="dxa" w:w="80"/>
+              <w:top w:type="dxa" w:w="60"/>
               <w:left w:type="dxa" w:w="280"/>
-              <w:bottom w:type="dxa" w:w="80"/>
+              <w:bottom w:type="dxa" w:w="60"/>
               <w:right w:type="dxa" w:w="0"/>
             </w:tcMar>
             <w:vAlign w:val="center"/>
@@ -1768,9 +1867,9 @@
               <w:right w:val="none" w:color="FFFFFF" w:sz="0"/>
             </w:tcBorders>
             <w:tcMar>
-              <w:top w:type="dxa" w:w="80"/>
-              <w:left w:type="dxa" w:w="0"/>
-              <w:bottom w:type="dxa" w:w="80"/>
+              <w:top w:type="dxa" w:w="60"/>
+              <w:left w:type="dxa" w:w="0"/>
+              <w:bottom w:type="dxa" w:w="60"/>
               <w:right w:type="dxa" w:w="140"/>
             </w:tcMar>
             <w:vAlign w:val="center"/>
@@ -1799,9 +1898,9 @@
               <w:right w:val="none" w:color="FFFFFF" w:sz="0"/>
             </w:tcBorders>
             <w:tcMar>
-              <w:top w:type="dxa" w:w="80"/>
-              <w:left w:type="dxa" w:w="0"/>
-              <w:bottom w:type="dxa" w:w="80"/>
+              <w:top w:type="dxa" w:w="60"/>
+              <w:left w:type="dxa" w:w="0"/>
+              <w:bottom w:type="dxa" w:w="60"/>
               <w:right w:type="dxa" w:w="140"/>
             </w:tcMar>
             <w:vAlign w:val="center"/>
@@ -1831,9 +1930,9 @@
               <w:right w:val="none" w:color="FFFFFF" w:sz="0"/>
             </w:tcBorders>
             <w:tcMar>
-              <w:top w:type="dxa" w:w="80"/>
+              <w:top w:type="dxa" w:w="60"/>
               <w:left w:type="dxa" w:w="280"/>
-              <w:bottom w:type="dxa" w:w="80"/>
+              <w:bottom w:type="dxa" w:w="60"/>
               <w:right w:type="dxa" w:w="0"/>
             </w:tcMar>
             <w:vAlign w:val="center"/>
@@ -1865,9 +1964,9 @@
               <w:right w:val="none" w:color="FFFFFF" w:sz="0"/>
             </w:tcBorders>
             <w:tcMar>
-              <w:top w:type="dxa" w:w="80"/>
-              <w:left w:type="dxa" w:w="0"/>
-              <w:bottom w:type="dxa" w:w="80"/>
+              <w:top w:type="dxa" w:w="60"/>
+              <w:left w:type="dxa" w:w="0"/>
+              <w:bottom w:type="dxa" w:w="60"/>
               <w:right w:type="dxa" w:w="140"/>
             </w:tcMar>
             <w:vAlign w:val="center"/>
@@ -1896,9 +1995,9 @@
               <w:right w:val="none" w:color="FFFFFF" w:sz="0"/>
             </w:tcBorders>
             <w:tcMar>
-              <w:top w:type="dxa" w:w="80"/>
-              <w:left w:type="dxa" w:w="0"/>
-              <w:bottom w:type="dxa" w:w="80"/>
+              <w:top w:type="dxa" w:w="60"/>
+              <w:left w:type="dxa" w:w="0"/>
+              <w:bottom w:type="dxa" w:w="60"/>
               <w:right w:type="dxa" w:w="140"/>
             </w:tcMar>
             <w:vAlign w:val="center"/>
@@ -1928,9 +2027,9 @@
               <w:right w:val="none" w:color="FFFFFF" w:sz="0"/>
             </w:tcBorders>
             <w:tcMar>
-              <w:top w:type="dxa" w:w="80"/>
+              <w:top w:type="dxa" w:w="60"/>
               <w:left w:type="dxa" w:w="280"/>
-              <w:bottom w:type="dxa" w:w="80"/>
+              <w:bottom w:type="dxa" w:w="60"/>
               <w:right w:type="dxa" w:w="0"/>
             </w:tcMar>
             <w:vAlign w:val="center"/>
@@ -1955,7 +2054,7 @@
         <w:pBdr>
           <w:bottom w:val="single" w:color="D5DAD6" w:sz="6"/>
         </w:pBdr>
-        <w:spacing w:after="110" w:before="240"/>
+        <w:spacing w:after="110" w:before="220"/>
       </w:pPr>
       <w:r>
         <w:rPr>
@@ -1976,16 +2075,16 @@
           <w:ilvl w:val="0"/>
           <w:numId w:val="2"/>
         </w:numPr>
-        <w:spacing w:after="50" w:line="252"/>
+        <w:spacing w:after="40" w:line="246"/>
       </w:pPr>
       <w:r>
         <w:rPr>
           <w:rFonts w:ascii="Calibri" w:cs="Calibri" w:eastAsia="Calibri" w:hAnsi="Calibri"/>
           <w:color w:val="1F2A26"/>
-          <w:sz w:val="21"/>
-          <w:szCs w:val="21"/>
-        </w:rPr>
-        <w:t xml:space="preserve">Moved awarded projects into the active workflow and confirmed the next required action for each account.</w:t>
+          <w:sz w:val="20"/>
+          <w:szCs w:val="20"/>
+        </w:rPr>
+        <w:t xml:space="preserve">Moved the 4 awarded projects into the active workflow and confirmed the next required action for each account.</w:t>
       </w:r>
     </w:p>
     <w:p>
@@ -1995,16 +2094,16 @@
           <w:ilvl w:val="0"/>
           <w:numId w:val="2"/>
         </w:numPr>
-        <w:spacing w:after="50" w:line="252"/>
+        <w:spacing w:after="40" w:line="246"/>
       </w:pPr>
       <w:r>
         <w:rPr>
           <w:rFonts w:ascii="Calibri" w:cs="Calibri" w:eastAsia="Calibri" w:hAnsi="Calibri"/>
           <w:color w:val="1F2A26"/>
-          <w:sz w:val="21"/>
-          <w:szCs w:val="21"/>
-        </w:rPr>
-        <w:t xml:space="preserve">Reviewed proposal-stage records and maintained follow-up dates for opportunities still awaiting a decision.</w:t>
+          <w:sz w:val="20"/>
+          <w:szCs w:val="20"/>
+        </w:rPr>
+        <w:t xml:space="preserve">Reviewed the 6 proposal-stage records and maintained follow-up dates for opportunities still awaiting a decision.</w:t>
       </w:r>
     </w:p>
     <w:p>
@@ -2014,16 +2113,16 @@
           <w:ilvl w:val="0"/>
           <w:numId w:val="2"/>
         </w:numPr>
-        <w:spacing w:after="50" w:line="252"/>
+        <w:spacing w:after="40" w:line="246"/>
       </w:pPr>
       <w:r>
         <w:rPr>
           <w:rFonts w:ascii="Calibri" w:cs="Calibri" w:eastAsia="Calibri" w:hAnsi="Calibri"/>
           <w:color w:val="1F2A26"/>
-          <w:sz w:val="21"/>
-          <w:szCs w:val="21"/>
-        </w:rPr>
-        <w:t xml:space="preserve">Updated closed project records so project status, notes, and values were complete and easy to reference.</w:t>
+          <w:sz w:val="20"/>
+          <w:szCs w:val="20"/>
+        </w:rPr>
+        <w:t xml:space="preserve">Updated all 5 closed project records so status, notes, and values were complete and easy to reference ($72K total).</w:t>
       </w:r>
     </w:p>
     <w:p>
@@ -2033,16 +2132,16 @@
           <w:ilvl w:val="0"/>
           <w:numId w:val="2"/>
         </w:numPr>
-        <w:spacing w:after="50" w:line="252"/>
+        <w:spacing w:after="40" w:line="246"/>
       </w:pPr>
       <w:r>
         <w:rPr>
           <w:rFonts w:ascii="Calibri" w:cs="Calibri" w:eastAsia="Calibri" w:hAnsi="Calibri"/>
           <w:color w:val="1F2A26"/>
-          <w:sz w:val="21"/>
-          <w:szCs w:val="21"/>
-        </w:rPr>
-        <w:t xml:space="preserve">Kept project records organized by stage to make open work, pending decisions, and completed projects easier to track.</w:t>
+          <w:sz w:val="20"/>
+          <w:szCs w:val="20"/>
+        </w:rPr>
+        <w:t xml:space="preserve">Kept project records organized across all 7 pipeline stages to make open work, pending decisions, and completed projects easier to track.</w:t>
       </w:r>
     </w:p>
     <w:p>
@@ -2051,7 +2150,7 @@
         <w:pBdr>
           <w:bottom w:val="single" w:color="D5DAD6" w:sz="6"/>
         </w:pBdr>
-        <w:spacing w:after="110" w:before="240"/>
+        <w:spacing w:after="110" w:before="220"/>
       </w:pPr>
       <w:r>
         <w:rPr>
@@ -2072,16 +2171,16 @@
           <w:ilvl w:val="0"/>
           <w:numId w:val="2"/>
         </w:numPr>
-        <w:spacing w:after="50" w:line="252"/>
+        <w:spacing w:after="40" w:line="246"/>
       </w:pPr>
       <w:r>
         <w:rPr>
           <w:rFonts w:ascii="Calibri" w:cs="Calibri" w:eastAsia="Calibri" w:hAnsi="Calibri"/>
           <w:color w:val="1F2A26"/>
-          <w:sz w:val="21"/>
-          <w:szCs w:val="21"/>
-        </w:rPr>
-        <w:t xml:space="preserve">Follow up on the eight pending items and document outcomes in the CRM.</w:t>
+          <w:sz w:val="20"/>
+          <w:szCs w:val="20"/>
+        </w:rPr>
+        <w:t xml:space="preserve">Follow up on the 8 pending items and document outcomes in the CRM.</w:t>
       </w:r>
     </w:p>
     <w:p>
@@ -2091,16 +2190,16 @@
           <w:ilvl w:val="0"/>
           <w:numId w:val="2"/>
         </w:numPr>
-        <w:spacing w:after="50" w:line="252"/>
+        <w:spacing w:after="40" w:line="246"/>
       </w:pPr>
       <w:r>
         <w:rPr>
           <w:rFonts w:ascii="Calibri" w:cs="Calibri" w:eastAsia="Calibri" w:hAnsi="Calibri"/>
           <w:color w:val="1F2A26"/>
-          <w:sz w:val="21"/>
-          <w:szCs w:val="21"/>
-        </w:rPr>
-        <w:t xml:space="preserve">Review bidding and proposal-stage projects first to prevent missed deadlines or stalled opportunities.</w:t>
+          <w:sz w:val="20"/>
+          <w:szCs w:val="20"/>
+        </w:rPr>
+        <w:t xml:space="preserve">Review the 7 bidding and 6 proposal-stage projects first to prevent missed deadlines or stalled opportunities.</w:t>
       </w:r>
     </w:p>
     <w:p>
@@ -2110,16 +2209,16 @@
           <w:ilvl w:val="0"/>
           <w:numId w:val="2"/>
         </w:numPr>
-        <w:spacing w:after="50" w:line="252"/>
+        <w:spacing w:after="40" w:line="246"/>
       </w:pPr>
       <w:r>
         <w:rPr>
           <w:rFonts w:ascii="Calibri" w:cs="Calibri" w:eastAsia="Calibri" w:hAnsi="Calibri"/>
           <w:color w:val="1F2A26"/>
-          <w:sz w:val="21"/>
-          <w:szCs w:val="21"/>
-        </w:rPr>
-        <w:t xml:space="preserve">Confirm that newly awarded projects have complete contact details, scope notes, and scheduled next steps.</w:t>
+          <w:sz w:val="20"/>
+          <w:szCs w:val="20"/>
+        </w:rPr>
+        <w:t xml:space="preserve">Confirm that the 4 newly awarded projects have complete contact details, scope notes, and scheduled next steps.</w:t>
       </w:r>
     </w:p>
     <w:p>
@@ -2129,14 +2228,14 @@
           <w:ilvl w:val="0"/>
           <w:numId w:val="2"/>
         </w:numPr>
-        <w:spacing w:after="50" w:line="252"/>
+        <w:spacing w:after="40" w:line="246"/>
       </w:pPr>
       <w:r>
         <w:rPr>
           <w:rFonts w:ascii="Calibri" w:cs="Calibri" w:eastAsia="Calibri" w:hAnsi="Calibri"/>
           <w:color w:val="1F2A26"/>
-          <w:sz w:val="21"/>
-          <w:szCs w:val="21"/>
+          <w:sz w:val="20"/>
+          <w:szCs w:val="20"/>
         </w:rPr>
         <w:t xml:space="preserve">Continue closing out completed work promptly so active pipeline totals remain accurate.</w:t>
       </w:r>
@@ -2147,7 +2246,7 @@
         <w:pBdr>
           <w:bottom w:val="single" w:color="D5DAD6" w:sz="6"/>
         </w:pBdr>
-        <w:spacing w:after="110" w:before="240"/>
+        <w:spacing w:after="110" w:before="220"/>
       </w:pPr>
       <w:r>
         <w:rPr>

</xml_diff>